<commit_message>
UPDATE: fixed some if the non ml methods for the saliency prediction and general clean up
</commit_message>
<xml_diff>
--- a/gazejepa/report_arash/report.docx
+++ b/gazejepa/report_arash/report.docx
@@ -209,7 +209,7 @@
           <w:i w:val="0"/>
           <w:sz w:val="24"/>
         </w:rPr>
-        <w:t>The FIND (Find-Who-to-Look-at) dataset (Liu &amp; Xu, 2016) contains eye-tracking recordings from 39 observers watching 62 multi-face social videos from YouTube and Youku at 1280×720 resolution. Fixations are recorded per frame, per observer, providing dense ground truth for gaze prediction. Three videos (019, 022, 057) are excluded due to quality issues, leaving 62 usable videos with fixation data stored as .mat files.</w:t>
+        <w:t>The FIND (Find-Who-to-Look-at) dataset (Liu &amp; Xu, 2016) contains eye-tracking recordings from 39 observers watching 65 multi-face social videos from YouTube and Youku at 1280x720 resolution. Fixations are recorded per frame for all 39 observers, stored as .mat files (fix_data_NEW/, key curr_v_all_s, shape (39, n_frames, 2) in pixel coordinates).</w:t>
       </w:r>
     </w:p>
     <w:p/>
@@ -301,7 +301,7 @@
           <w:i w:val="0"/>
           <w:sz w:val="24"/>
         </w:rPr>
-        <w:t>Local contrast (classical). A signal-processing approach based on local image contrast (Itti &amp; Koch, 1998). Pixels that differ strongly from their neighborhood receive high saliency. No learning required.</w:t>
+        <w:t>Spectral residual (classical, Itti &amp; Koch 1998 tradition). We implemented the classical Itti-Koch saliency approach using OpenCV's static saliency detector (StaticSaliencySpectralResidual), which realises a related algorithm by Hou &amp; Zhang (CVPR 2007). Both methods are bottom-up, non-learned, and signal-processing based: they identify salient regions from local contrast and deviation from the image's average statistics, with no knowledge of faces or semantics.</w:t>
       </w:r>
     </w:p>
     <w:p/>
@@ -537,7 +537,7 @@
           </w:tcPr>
           <w:p>
             <w:r>
-              <w:t>0.503</w:t>
+              <w:t>0.499</w:t>
             </w:r>
           </w:p>
         </w:tc>
@@ -547,7 +547,7 @@
           </w:tcPr>
           <w:p>
             <w:r>
-              <w:t>0.011</w:t>
+              <w:t>-0.004</w:t>
             </w:r>
           </w:p>
         </w:tc>
@@ -611,7 +611,7 @@
           </w:tcPr>
           <w:p>
             <w:r>
-              <w:t>Local contrast (classical)</w:t>
+              <w:t>Spectral residual (classical)</w:t>
             </w:r>
           </w:p>
         </w:tc>
@@ -621,7 +621,7 @@
           </w:tcPr>
           <w:p>
             <w:r>
-              <w:t>0.556</w:t>
+              <w:t>0.687</w:t>
             </w:r>
           </w:p>
         </w:tc>
@@ -631,7 +631,7 @@
           </w:tcPr>
           <w:p>
             <w:r>
-              <w:t>0.218</w:t>
+              <w:t>0.391</w:t>
             </w:r>
           </w:p>
         </w:tc>
@@ -641,7 +641,7 @@
           </w:tcPr>
           <w:p>
             <w:r>
-              <w:t>0.029</w:t>
+              <w:t>0.132</w:t>
             </w:r>
           </w:p>
         </w:tc>
@@ -721,7 +721,7 @@
           <w:i w:val="0"/>
           <w:sz w:val="24"/>
         </w:rPr>
-        <w:t>The random baseline achieves AUC = 0.503, confirming it performs at chance level and validating the evaluation pipeline. This also directly quantifies what SaccadeJEPA produces when used as a gaze simulator: effectively random fixations with no predictive power over human gaze.</w:t>
+        <w:t>The random baseline achieves AUC = 0.499, confirming it performs at chance level and validating the evaluation pipeline. This also directly quantifies what SaccadeJEPA produces when used as a gaze simulator: effectively random fixations with no predictive power over human gaze.</w:t>
       </w:r>
     </w:p>
     <w:p/>
@@ -733,7 +733,7 @@
           <w:i w:val="0"/>
           <w:sz w:val="24"/>
         </w:rPr>
-        <w:t>Local contrast (classical) scores only marginally above chance (AUC = 0.556), confirming that bottom-up visual features such as edges and contrast gradients are poor predictors of gaze on social content. People look at faces for social and semantic reasons, not because faces are high-contrast regions.</w:t>
+        <w:t>Spectral residual (classical) achieves AUC = 0.687, a meaningful improvement over both chance and center bias, though NSS (0.391) and CC (0.132) remain well below the learned model. Classical signal-processing saliency highlights edges and contrast but does not model faces or semantic content, so it underperforms on face-dominated social video.</w:t>
       </w:r>
     </w:p>
     <w:p/>
@@ -851,7 +851,7 @@
           <w:i w:val="0"/>
           <w:sz w:val="24"/>
         </w:rPr>
-        <w:t>The improvement is substantial: replacing random sampling (AUC = 0.503) with ResNetSaliency (AUC = 0.891) reduces the gap to perfect gaze prediction by 78% in AUC terms and increases NSS from effectively zero (0.011) to 2.549.</w:t>
+        <w:t>The improvement is substantial: replacing random sampling (AUC = 0.499) with ResNetSaliency (AUC = 0.891) reduces the gap to perfect gaze prediction by 78% in AUC terms and increases NSS from effectively zero (-0.004) to 2.549.</w:t>
       </w:r>
     </w:p>
     <w:p>
@@ -873,7 +873,7 @@
           <w:i w:val="0"/>
           <w:sz w:val="24"/>
         </w:rPr>
-        <w:t>SaccadeJEPA is a representation learning model, not a gaze simulator. Its saccade targets are uniformly random, producing fixation patterns indistinguishable from chance. By replacing the random sampling with a ResNet-18 saliency predictor trained on human eye-tracking data from the FIND dataset, we obtain a content-driven gaze model that achieves AUC = 0.891 and NSS = 2.549 on held-out social videos — compared to AUC = 0.503 for the SaccadeJEPA baseline.</w:t>
+        <w:t>SaccadeJEPA is a representation learning model, not a gaze simulator. Its saccade targets are uniformly random, producing fixation patterns indistinguishable from chance. By replacing the random sampling with a ResNet-18 saliency predictor trained on human eye-tracking data from the FIND dataset, we obtain a content-driven gaze model that achieves AUC = 0.891 and NSS = 2.549 on held-out social videos — compared to AUC = 0.499 for the SaccadeJEPA baseline.</w:t>
       </w:r>
     </w:p>
     <w:p/>

</xml_diff>